<commit_message>
feat: CODAP only on the Data Lab page, and typeable blanks in the template
Sebastian settled on CODAP as the tool, so the Excel panel is gone from
"How to plot it" and the page says which tool we are using rather than
offering a choice. Excel was never viable once the lab went to
Chromebooks: Excel for the web cannot open a .csv at all. The r box no
longer says "neither tool", and the CODAP steps gain a screenshot step,
since the write-up now happens off that picture.

The template's fill-in-the-blank sentences were runs of underscores,
which you cannot type into once the file is a Google Doc. Name, class and
date, the Q2 question shape, the Q7 association sentence and the Q9
gradient and intercept are now shaded cells you click into.

Co-Authored-By: Claude Opus 5 <noreply@anthropic.com>
Claude-Session: https://claude.ai/code/session_01NirdDpEkz972L2Wn9EY8FV
</commit_message>
<xml_diff>
--- a/src/datalab/Y10_Data_Lab_Investigation_Template.docx
+++ b/src/datalab/Y10_Data_Lab_Investigation_Template.docx
@@ -22,11 +22,140 @@
         <w:t>Year 10 Statistics  ...  type into this, then submit it on Compass</w:t>
       </w:r>
     </w:p>
-    <w:p>
-      <w:r>
-        <w:t>Name: ______________________________        Class: ______________        Date: ____________</w:t>
-      </w:r>
-    </w:p>
+    <w:tbl>
+      <w:tblPr>
+        <w:tblW w:type="auto" w:w="0"/>
+        <w:tblLayout w:type="fixed"/>
+        <w:tblLook w:firstColumn="1" w:firstRow="1" w:lastColumn="0" w:lastRow="0" w:noHBand="0" w:noVBand="1" w:val="04A0"/>
+      </w:tblPr>
+      <w:tblGrid>
+        <w:gridCol w:w="1800"/>
+        <w:gridCol w:w="1800"/>
+        <w:gridCol w:w="1800"/>
+        <w:gridCol w:w="1800"/>
+        <w:gridCol w:w="1800"/>
+        <w:gridCol w:w="1800"/>
+      </w:tblGrid>
+      <w:tr>
+        <w:trPr>
+          <w:cantSplit/>
+        </w:trPr>
+        <w:tc>
+          <w:tcPr>
+            <w:tcW w:type="dxa" w:w="723"/>
+            <w:vAlign w:val="bottom"/>
+            <w:tcMar>
+              <w:left w:w="34" w:type="dxa"/>
+              <w:right w:w="34" w:type="dxa"/>
+            </w:tcMar>
+          </w:tcPr>
+          <w:p>
+            <w:pPr>
+              <w:spacing w:after="0"/>
+            </w:pPr>
+            <w:r>
+              <w:rPr>
+                <w:b/>
+                <w:sz w:val="21"/>
+              </w:rPr>
+              <w:t>Name:</w:t>
+            </w:r>
+          </w:p>
+        </w:tc>
+        <w:tc>
+          <w:tcPr>
+            <w:tcW w:type="dxa" w:w="3628"/>
+            <w:vAlign w:val="bottom"/>
+            <w:tcMar>
+              <w:left w:w="34" w:type="dxa"/>
+              <w:right w:w="34" w:type="dxa"/>
+            </w:tcMar>
+            <w:shd w:val="clear" w:fill="E4ECF9"/>
+          </w:tcPr>
+          <w:p>
+            <w:pPr>
+              <w:spacing w:after="0"/>
+            </w:pPr>
+          </w:p>
+        </w:tc>
+        <w:tc>
+          <w:tcPr>
+            <w:tcW w:type="dxa" w:w="839"/>
+            <w:vAlign w:val="bottom"/>
+            <w:tcMar>
+              <w:left w:w="34" w:type="dxa"/>
+              <w:right w:w="34" w:type="dxa"/>
+            </w:tcMar>
+          </w:tcPr>
+          <w:p>
+            <w:pPr>
+              <w:spacing w:after="0"/>
+            </w:pPr>
+            <w:r>
+              <w:rPr>
+                <w:b/>
+                <w:sz w:val="21"/>
+              </w:rPr>
+              <w:t>Class:</w:t>
+            </w:r>
+          </w:p>
+        </w:tc>
+        <w:tc>
+          <w:tcPr>
+            <w:tcW w:type="dxa" w:w="1701"/>
+            <w:vAlign w:val="bottom"/>
+            <w:tcMar>
+              <w:left w:w="34" w:type="dxa"/>
+              <w:right w:w="34" w:type="dxa"/>
+            </w:tcMar>
+            <w:shd w:val="clear" w:fill="E4ECF9"/>
+          </w:tcPr>
+          <w:p>
+            <w:pPr>
+              <w:spacing w:after="0"/>
+            </w:pPr>
+          </w:p>
+        </w:tc>
+        <w:tc>
+          <w:tcPr>
+            <w:tcW w:type="dxa" w:w="723"/>
+            <w:vAlign w:val="bottom"/>
+            <w:tcMar>
+              <w:left w:w="34" w:type="dxa"/>
+              <w:right w:w="34" w:type="dxa"/>
+            </w:tcMar>
+          </w:tcPr>
+          <w:p>
+            <w:pPr>
+              <w:spacing w:after="0"/>
+            </w:pPr>
+            <w:r>
+              <w:rPr>
+                <w:b/>
+                <w:sz w:val="21"/>
+              </w:rPr>
+              <w:t>Date:</w:t>
+            </w:r>
+          </w:p>
+        </w:tc>
+        <w:tc>
+          <w:tcPr>
+            <w:tcW w:type="dxa" w:w="1701"/>
+            <w:vAlign w:val="bottom"/>
+            <w:tcMar>
+              <w:left w:w="34" w:type="dxa"/>
+              <w:right w:w="34" w:type="dxa"/>
+            </w:tcMar>
+            <w:shd w:val="clear" w:fill="E4ECF9"/>
+          </w:tcPr>
+          <w:p>
+            <w:pPr>
+              <w:spacing w:after="0"/>
+            </w:pPr>
+          </w:p>
+        </w:tc>
+      </w:tr>
+    </w:tbl>
     <w:tbl>
       <w:tblPr>
         <w:tblLayout w:type="fixed"/>
@@ -305,23 +434,166 @@
           <w:i w:val="0"/>
           <w:sz w:val="21"/>
         </w:rPr>
-        <w:t>This is the whole investigation, so get it right. Use this shape:</w:t>
+        <w:t>This is the whole investigation, so get it right. Fill in the shape, then write the whole thing out underneath.</w:t>
       </w:r>
     </w:p>
-    <w:p>
-      <w:pPr>
-        <w:spacing w:after="80"/>
-        <w:keepNext/>
-      </w:pPr>
-      <w:r>
-        <w:rPr>
-          <w:b/>
-          <w:i w:val="0"/>
-          <w:sz w:val="21"/>
-        </w:rPr>
-        <w:t xml:space="preserve">        Is there a relationship between ____________ and ____________ in ____________ ?</w:t>
-      </w:r>
-    </w:p>
+    <w:tbl>
+      <w:tblPr>
+        <w:tblW w:type="auto" w:w="0"/>
+        <w:tblLayout w:type="fixed"/>
+        <w:tblLook w:firstColumn="1" w:firstRow="1" w:lastColumn="0" w:lastRow="0" w:noHBand="0" w:noVBand="1" w:val="04A0"/>
+      </w:tblPr>
+      <w:tblGrid>
+        <w:gridCol w:w="1543"/>
+        <w:gridCol w:w="1543"/>
+        <w:gridCol w:w="1543"/>
+        <w:gridCol w:w="1543"/>
+        <w:gridCol w:w="1543"/>
+        <w:gridCol w:w="1543"/>
+        <w:gridCol w:w="1543"/>
+      </w:tblGrid>
+      <w:tr>
+        <w:trPr>
+          <w:cantSplit/>
+        </w:trPr>
+        <w:tc>
+          <w:tcPr>
+            <w:tcW w:type="dxa" w:w="3745"/>
+            <w:vAlign w:val="bottom"/>
+            <w:tcMar>
+              <w:left w:w="34" w:type="dxa"/>
+              <w:right w:w="34" w:type="dxa"/>
+            </w:tcMar>
+          </w:tcPr>
+          <w:p>
+            <w:pPr>
+              <w:spacing w:after="0"/>
+            </w:pPr>
+            <w:r>
+              <w:rPr>
+                <w:b/>
+                <w:sz w:val="21"/>
+              </w:rPr>
+              <w:t>Is there a relationship between</w:t>
+            </w:r>
+          </w:p>
+        </w:tc>
+        <w:tc>
+          <w:tcPr>
+            <w:tcW w:type="dxa" w:w="1417"/>
+            <w:vAlign w:val="bottom"/>
+            <w:tcMar>
+              <w:left w:w="34" w:type="dxa"/>
+              <w:right w:w="34" w:type="dxa"/>
+            </w:tcMar>
+            <w:shd w:val="clear" w:fill="E4ECF9"/>
+          </w:tcPr>
+          <w:p>
+            <w:pPr>
+              <w:spacing w:after="0"/>
+            </w:pPr>
+          </w:p>
+        </w:tc>
+        <w:tc>
+          <w:tcPr>
+            <w:tcW w:type="dxa" w:w="490"/>
+            <w:vAlign w:val="bottom"/>
+            <w:tcMar>
+              <w:left w:w="34" w:type="dxa"/>
+              <w:right w:w="34" w:type="dxa"/>
+            </w:tcMar>
+          </w:tcPr>
+          <w:p>
+            <w:pPr>
+              <w:spacing w:after="0"/>
+            </w:pPr>
+            <w:r>
+              <w:rPr>
+                <w:b/>
+                <w:sz w:val="21"/>
+              </w:rPr>
+              <w:t>and</w:t>
+            </w:r>
+          </w:p>
+        </w:tc>
+        <w:tc>
+          <w:tcPr>
+            <w:tcW w:type="dxa" w:w="1417"/>
+            <w:vAlign w:val="bottom"/>
+            <w:tcMar>
+              <w:left w:w="34" w:type="dxa"/>
+              <w:right w:w="34" w:type="dxa"/>
+            </w:tcMar>
+            <w:shd w:val="clear" w:fill="E4ECF9"/>
+          </w:tcPr>
+          <w:p>
+            <w:pPr>
+              <w:spacing w:after="0"/>
+            </w:pPr>
+          </w:p>
+        </w:tc>
+        <w:tc>
+          <w:tcPr>
+            <w:tcW w:type="dxa" w:w="374"/>
+            <w:vAlign w:val="bottom"/>
+            <w:tcMar>
+              <w:left w:w="34" w:type="dxa"/>
+              <w:right w:w="34" w:type="dxa"/>
+            </w:tcMar>
+          </w:tcPr>
+          <w:p>
+            <w:pPr>
+              <w:spacing w:after="0"/>
+            </w:pPr>
+            <w:r>
+              <w:rPr>
+                <w:b/>
+                <w:sz w:val="21"/>
+              </w:rPr>
+              <w:t>in</w:t>
+            </w:r>
+          </w:p>
+        </w:tc>
+        <w:tc>
+          <w:tcPr>
+            <w:tcW w:type="dxa" w:w="1417"/>
+            <w:vAlign w:val="bottom"/>
+            <w:tcMar>
+              <w:left w:w="34" w:type="dxa"/>
+              <w:right w:w="34" w:type="dxa"/>
+            </w:tcMar>
+            <w:shd w:val="clear" w:fill="E4ECF9"/>
+          </w:tcPr>
+          <w:p>
+            <w:pPr>
+              <w:spacing w:after="0"/>
+            </w:pPr>
+          </w:p>
+        </w:tc>
+        <w:tc>
+          <w:tcPr>
+            <w:tcW w:type="dxa" w:w="312"/>
+            <w:vAlign w:val="bottom"/>
+            <w:tcMar>
+              <w:left w:w="34" w:type="dxa"/>
+              <w:right w:w="34" w:type="dxa"/>
+            </w:tcMar>
+          </w:tcPr>
+          <w:p>
+            <w:pPr>
+              <w:spacing w:after="0"/>
+            </w:pPr>
+            <w:r>
+              <w:rPr>
+                <w:b/>
+                <w:sz w:val="21"/>
+              </w:rPr>
+              <w:t>?</w:t>
+            </w:r>
+          </w:p>
+        </w:tc>
+      </w:tr>
+    </w:tbl>
     <w:p>
       <w:pPr>
         <w:spacing w:before="140" w:after="20"/>
@@ -332,7 +604,7 @@
           <w:b/>
           <w:sz w:val="21"/>
         </w:rPr>
-        <w:t>My question:</w:t>
+        <w:t>My question, written out in full:</w:t>
       </w:r>
     </w:p>
     <w:tbl>
@@ -402,7 +674,7 @@
                 <w:b/>
                 <w:sz w:val="21"/>
               </w:rPr>
-              <w:t>Check your question before you go on. Change ☐ to ☑ for each one you pass.</w:t>
+              <w:t>Check your question before you go on. Put an x in each box you pass.</w:t>
             </w:r>
           </w:p>
           <w:p>
@@ -1226,20 +1498,257 @@
         <w:t>House sentence. Fill in all three words.</w:t>
       </w:r>
     </w:p>
-    <w:p>
-      <w:pPr>
-        <w:spacing w:after="60"/>
-        <w:keepNext/>
-      </w:pPr>
-      <w:r>
-        <w:rPr>
-          <w:b/>
-          <w:i w:val="0"/>
-          <w:sz w:val="21"/>
-        </w:rPr>
-        <w:t xml:space="preserve">        There is a ____________ , ____________ , ____________ association between ____________ and ____________ .</w:t>
-      </w:r>
-    </w:p>
+    <w:tbl>
+      <w:tblPr>
+        <w:tblW w:type="auto" w:w="0"/>
+        <w:tblLayout w:type="fixed"/>
+        <w:tblLook w:firstColumn="1" w:firstRow="1" w:lastColumn="0" w:lastRow="0" w:noHBand="0" w:noVBand="1" w:val="04A0"/>
+      </w:tblPr>
+      <w:tblGrid>
+        <w:gridCol w:w="1543"/>
+        <w:gridCol w:w="1543"/>
+        <w:gridCol w:w="1543"/>
+        <w:gridCol w:w="1543"/>
+        <w:gridCol w:w="1543"/>
+        <w:gridCol w:w="1543"/>
+        <w:gridCol w:w="1543"/>
+      </w:tblGrid>
+      <w:tr>
+        <w:trPr>
+          <w:cantSplit/>
+        </w:trPr>
+        <w:tc>
+          <w:tcPr>
+            <w:tcW w:type="dxa" w:w="1304"/>
+            <w:vAlign w:val="bottom"/>
+            <w:tcMar>
+              <w:left w:w="34" w:type="dxa"/>
+              <w:right w:w="34" w:type="dxa"/>
+            </w:tcMar>
+          </w:tcPr>
+          <w:p>
+            <w:pPr>
+              <w:spacing w:after="0"/>
+            </w:pPr>
+            <w:r>
+              <w:rPr>
+                <w:b/>
+                <w:sz w:val="21"/>
+              </w:rPr>
+              <w:t>There is a</w:t>
+            </w:r>
+          </w:p>
+        </w:tc>
+        <w:tc>
+          <w:tcPr>
+            <w:tcW w:type="dxa" w:w="1417"/>
+            <w:vAlign w:val="bottom"/>
+            <w:tcMar>
+              <w:left w:w="34" w:type="dxa"/>
+              <w:right w:w="34" w:type="dxa"/>
+            </w:tcMar>
+            <w:shd w:val="clear" w:fill="E4ECF9"/>
+          </w:tcPr>
+          <w:p>
+            <w:pPr>
+              <w:spacing w:after="0"/>
+            </w:pPr>
+          </w:p>
+        </w:tc>
+        <w:tc>
+          <w:tcPr>
+            <w:tcW w:type="dxa" w:w="312"/>
+            <w:vAlign w:val="bottom"/>
+            <w:tcMar>
+              <w:left w:w="34" w:type="dxa"/>
+              <w:right w:w="34" w:type="dxa"/>
+            </w:tcMar>
+          </w:tcPr>
+          <w:p>
+            <w:pPr>
+              <w:spacing w:after="0"/>
+            </w:pPr>
+            <w:r>
+              <w:rPr>
+                <w:b/>
+                <w:sz w:val="21"/>
+              </w:rPr>
+              <w:t>,</w:t>
+            </w:r>
+          </w:p>
+        </w:tc>
+        <w:tc>
+          <w:tcPr>
+            <w:tcW w:type="dxa" w:w="1417"/>
+            <w:vAlign w:val="bottom"/>
+            <w:tcMar>
+              <w:left w:w="34" w:type="dxa"/>
+              <w:right w:w="34" w:type="dxa"/>
+            </w:tcMar>
+            <w:shd w:val="clear" w:fill="E4ECF9"/>
+          </w:tcPr>
+          <w:p>
+            <w:pPr>
+              <w:spacing w:after="0"/>
+            </w:pPr>
+          </w:p>
+        </w:tc>
+        <w:tc>
+          <w:tcPr>
+            <w:tcW w:type="dxa" w:w="312"/>
+            <w:vAlign w:val="bottom"/>
+            <w:tcMar>
+              <w:left w:w="34" w:type="dxa"/>
+              <w:right w:w="34" w:type="dxa"/>
+            </w:tcMar>
+          </w:tcPr>
+          <w:p>
+            <w:pPr>
+              <w:spacing w:after="0"/>
+            </w:pPr>
+            <w:r>
+              <w:rPr>
+                <w:b/>
+                <w:sz w:val="21"/>
+              </w:rPr>
+              <w:t>,</w:t>
+            </w:r>
+          </w:p>
+        </w:tc>
+        <w:tc>
+          <w:tcPr>
+            <w:tcW w:type="dxa" w:w="1417"/>
+            <w:vAlign w:val="bottom"/>
+            <w:tcMar>
+              <w:left w:w="34" w:type="dxa"/>
+              <w:right w:w="34" w:type="dxa"/>
+            </w:tcMar>
+            <w:shd w:val="clear" w:fill="E4ECF9"/>
+          </w:tcPr>
+          <w:p>
+            <w:pPr>
+              <w:spacing w:after="0"/>
+            </w:pPr>
+          </w:p>
+        </w:tc>
+        <w:tc>
+          <w:tcPr>
+            <w:tcW w:type="dxa" w:w="2350"/>
+            <w:vAlign w:val="bottom"/>
+            <w:tcMar>
+              <w:left w:w="34" w:type="dxa"/>
+              <w:right w:w="34" w:type="dxa"/>
+            </w:tcMar>
+          </w:tcPr>
+          <w:p>
+            <w:pPr>
+              <w:spacing w:after="0"/>
+            </w:pPr>
+            <w:r>
+              <w:rPr>
+                <w:b/>
+                <w:sz w:val="21"/>
+              </w:rPr>
+              <w:t>association between</w:t>
+            </w:r>
+          </w:p>
+        </w:tc>
+      </w:tr>
+    </w:tbl>
+    <w:tbl>
+      <w:tblPr>
+        <w:tblW w:type="auto" w:w="0"/>
+        <w:tblLayout w:type="fixed"/>
+        <w:tblLook w:firstColumn="1" w:firstRow="1" w:lastColumn="0" w:lastRow="0" w:noHBand="0" w:noVBand="1" w:val="04A0"/>
+      </w:tblPr>
+      <w:tblGrid>
+        <w:gridCol w:w="2700"/>
+        <w:gridCol w:w="2700"/>
+        <w:gridCol w:w="2700"/>
+        <w:gridCol w:w="2700"/>
+      </w:tblGrid>
+      <w:tr>
+        <w:trPr>
+          <w:cantSplit/>
+        </w:trPr>
+        <w:tc>
+          <w:tcPr>
+            <w:tcW w:type="dxa" w:w="1417"/>
+            <w:vAlign w:val="bottom"/>
+            <w:tcMar>
+              <w:left w:w="34" w:type="dxa"/>
+              <w:right w:w="34" w:type="dxa"/>
+            </w:tcMar>
+            <w:shd w:val="clear" w:fill="E4ECF9"/>
+          </w:tcPr>
+          <w:p>
+            <w:pPr>
+              <w:spacing w:after="0"/>
+            </w:pPr>
+          </w:p>
+        </w:tc>
+        <w:tc>
+          <w:tcPr>
+            <w:tcW w:type="dxa" w:w="490"/>
+            <w:vAlign w:val="bottom"/>
+            <w:tcMar>
+              <w:left w:w="34" w:type="dxa"/>
+              <w:right w:w="34" w:type="dxa"/>
+            </w:tcMar>
+          </w:tcPr>
+          <w:p>
+            <w:pPr>
+              <w:spacing w:after="0"/>
+            </w:pPr>
+            <w:r>
+              <w:rPr>
+                <w:b/>
+                <w:sz w:val="21"/>
+              </w:rPr>
+              <w:t>and</w:t>
+            </w:r>
+          </w:p>
+        </w:tc>
+        <w:tc>
+          <w:tcPr>
+            <w:tcW w:type="dxa" w:w="1417"/>
+            <w:vAlign w:val="bottom"/>
+            <w:tcMar>
+              <w:left w:w="34" w:type="dxa"/>
+              <w:right w:w="34" w:type="dxa"/>
+            </w:tcMar>
+            <w:shd w:val="clear" w:fill="E4ECF9"/>
+          </w:tcPr>
+          <w:p>
+            <w:pPr>
+              <w:spacing w:after="0"/>
+            </w:pPr>
+          </w:p>
+        </w:tc>
+        <w:tc>
+          <w:tcPr>
+            <w:tcW w:type="dxa" w:w="312"/>
+            <w:vAlign w:val="bottom"/>
+            <w:tcMar>
+              <w:left w:w="34" w:type="dxa"/>
+              <w:right w:w="34" w:type="dxa"/>
+            </w:tcMar>
+          </w:tcPr>
+          <w:p>
+            <w:pPr>
+              <w:spacing w:after="0"/>
+            </w:pPr>
+            <w:r>
+              <w:rPr>
+                <w:b/>
+                <w:sz w:val="21"/>
+              </w:rPr>
+              <w:t>.</w:t>
+            </w:r>
+          </w:p>
+        </w:tc>
+      </w:tr>
+    </w:tbl>
     <w:p>
       <w:pPr>
         <w:keepNext/>
@@ -1322,7 +1831,7 @@
           <w:i w:val="0"/>
           <w:sz w:val="21"/>
         </w:rPr>
-        <w:t>Your tool gives you R squared. Turn it into r, and show the working.</w:t>
+        <w:t>CODAP gives you R squared, not r. Turn it into r, and show the working.</w:t>
       </w:r>
     </w:p>
     <w:p>
@@ -1335,7 +1844,7 @@
           <w:b/>
           <w:sz w:val="21"/>
         </w:rPr>
-        <w:t>(a)  R squared from the tool:</w:t>
+        <w:t>(a)  R squared from CODAP:</w:t>
       </w:r>
     </w:p>
     <w:tbl>
@@ -1519,7 +2028,7 @@
           <w:i w:val="0"/>
           <w:sz w:val="21"/>
         </w:rPr>
-        <w:t>Write down the equation your tool drew, then translate it into English. This is the bit that actually matters.</w:t>
+        <w:t>Write down the equation CODAP drew, then translate it into English. This is the bit that actually matters.</w:t>
       </w:r>
     </w:p>
     <w:p>
@@ -1564,17 +2073,111 @@
     </w:tbl>
     <w:p>
       <w:pPr>
-        <w:spacing w:before="140" w:after="20"/>
         <w:keepNext/>
       </w:pPr>
       <w:r>
         <w:rPr>
           <w:b/>
+          <w:i w:val="0"/>
           <w:sz w:val="21"/>
         </w:rPr>
-        <w:t>(b)  The gradient is ______ , which in this context means that every extra one:</w:t>
+        <w:t>(b)  The gradient, and what it means in this context.</w:t>
       </w:r>
     </w:p>
+    <w:tbl>
+      <w:tblPr>
+        <w:tblW w:type="auto" w:w="0"/>
+        <w:tblLayout w:type="fixed"/>
+        <w:tblLook w:firstColumn="1" w:firstRow="1" w:lastColumn="0" w:lastRow="0" w:noHBand="0" w:noVBand="1" w:val="04A0"/>
+      </w:tblPr>
+      <w:tblGrid>
+        <w:gridCol w:w="2700"/>
+        <w:gridCol w:w="2700"/>
+        <w:gridCol w:w="2700"/>
+        <w:gridCol w:w="2700"/>
+      </w:tblGrid>
+      <w:tr>
+        <w:trPr>
+          <w:cantSplit/>
+        </w:trPr>
+        <w:tc>
+          <w:tcPr>
+            <w:tcW w:type="dxa" w:w="1885"/>
+            <w:vAlign w:val="bottom"/>
+            <w:tcMar>
+              <w:left w:w="34" w:type="dxa"/>
+              <w:right w:w="34" w:type="dxa"/>
+            </w:tcMar>
+          </w:tcPr>
+          <w:p>
+            <w:pPr>
+              <w:spacing w:after="0"/>
+            </w:pPr>
+            <w:r>
+              <w:rPr>
+                <w:b/>
+                <w:sz w:val="21"/>
+              </w:rPr>
+              <w:t>The gradient is</w:t>
+            </w:r>
+          </w:p>
+        </w:tc>
+        <w:tc>
+          <w:tcPr>
+            <w:tcW w:type="dxa" w:w="1417"/>
+            <w:vAlign w:val="bottom"/>
+            <w:tcMar>
+              <w:left w:w="34" w:type="dxa"/>
+              <w:right w:w="34" w:type="dxa"/>
+            </w:tcMar>
+            <w:shd w:val="clear" w:fill="E4ECF9"/>
+          </w:tcPr>
+          <w:p>
+            <w:pPr>
+              <w:spacing w:after="0"/>
+            </w:pPr>
+          </w:p>
+        </w:tc>
+        <w:tc>
+          <w:tcPr>
+            <w:tcW w:type="dxa" w:w="3512"/>
+            <w:vAlign w:val="bottom"/>
+            <w:tcMar>
+              <w:left w:w="34" w:type="dxa"/>
+              <w:right w:w="34" w:type="dxa"/>
+            </w:tcMar>
+          </w:tcPr>
+          <w:p>
+            <w:pPr>
+              <w:spacing w:after="0"/>
+            </w:pPr>
+            <w:r>
+              <w:rPr>
+                <w:b/>
+                <w:sz w:val="21"/>
+              </w:rPr>
+              <w:t>, which means every extra one</w:t>
+            </w:r>
+          </w:p>
+        </w:tc>
+        <w:tc>
+          <w:tcPr>
+            <w:tcW w:type="dxa" w:w="1417"/>
+            <w:vAlign w:val="bottom"/>
+            <w:tcMar>
+              <w:left w:w="34" w:type="dxa"/>
+              <w:right w:w="34" w:type="dxa"/>
+            </w:tcMar>
+            <w:shd w:val="clear" w:fill="E4ECF9"/>
+          </w:tcPr>
+          <w:p>
+            <w:pPr>
+              <w:spacing w:after="0"/>
+            </w:pPr>
+          </w:p>
+        </w:tc>
+      </w:tr>
+    </w:tbl>
     <w:tbl>
       <w:tblPr>
         <w:tblLayout w:type="fixed"/>
@@ -1598,6 +2201,14 @@
             <w:pPr>
               <w:spacing w:after="0"/>
             </w:pPr>
+            <w:r>
+              <w:rPr>
+                <w:i/>
+                <w:color w:val="8C8C8C"/>
+                <w:sz w:val="18"/>
+              </w:rPr>
+              <w:t>... is worth this much more of the other thing. Write it as a sentence, in your own units.</w:t>
+            </w:r>
           </w:p>
           <w:p>
             <w:pPr>
@@ -1609,17 +2220,71 @@
     </w:tbl>
     <w:p>
       <w:pPr>
-        <w:spacing w:before="140" w:after="20"/>
         <w:keepNext/>
       </w:pPr>
       <w:r>
         <w:rPr>
           <w:b/>
+          <w:i w:val="0"/>
           <w:sz w:val="21"/>
         </w:rPr>
-        <w:t>(c)  The y-intercept is ______ . Does it mean anything real here, or is it nonsense like a penguin with no flippers?</w:t>
+        <w:t>(c)  The y-intercept, and whether it means anything real.</w:t>
       </w:r>
     </w:p>
+    <w:tbl>
+      <w:tblPr>
+        <w:tblW w:type="auto" w:w="0"/>
+        <w:tblLayout w:type="fixed"/>
+        <w:tblLook w:firstColumn="1" w:firstRow="1" w:lastColumn="0" w:lastRow="0" w:noHBand="0" w:noVBand="1" w:val="04A0"/>
+      </w:tblPr>
+      <w:tblGrid>
+        <w:gridCol w:w="5400"/>
+        <w:gridCol w:w="5400"/>
+      </w:tblGrid>
+      <w:tr>
+        <w:trPr>
+          <w:cantSplit/>
+        </w:trPr>
+        <w:tc>
+          <w:tcPr>
+            <w:tcW w:type="dxa" w:w="2234"/>
+            <w:vAlign w:val="bottom"/>
+            <w:tcMar>
+              <w:left w:w="34" w:type="dxa"/>
+              <w:right w:w="34" w:type="dxa"/>
+            </w:tcMar>
+          </w:tcPr>
+          <w:p>
+            <w:pPr>
+              <w:spacing w:after="0"/>
+            </w:pPr>
+            <w:r>
+              <w:rPr>
+                <w:b/>
+                <w:sz w:val="21"/>
+              </w:rPr>
+              <w:t>The y-intercept is</w:t>
+            </w:r>
+          </w:p>
+        </w:tc>
+        <w:tc>
+          <w:tcPr>
+            <w:tcW w:type="dxa" w:w="1417"/>
+            <w:vAlign w:val="bottom"/>
+            <w:tcMar>
+              <w:left w:w="34" w:type="dxa"/>
+              <w:right w:w="34" w:type="dxa"/>
+            </w:tcMar>
+            <w:shd w:val="clear" w:fill="E4ECF9"/>
+          </w:tcPr>
+          <w:p>
+            <w:pPr>
+              <w:spacing w:after="0"/>
+            </w:pPr>
+          </w:p>
+        </w:tc>
+      </w:tr>
+    </w:tbl>
     <w:tbl>
       <w:tblPr>
         <w:tblLayout w:type="fixed"/>
@@ -1643,6 +2308,14 @@
             <w:pPr>
               <w:spacing w:after="0"/>
             </w:pPr>
+            <w:r>
+              <w:rPr>
+                <w:i/>
+                <w:color w:val="8C8C8C"/>
+                <w:sz w:val="18"/>
+              </w:rPr>
+              <w:t>Does it mean anything real here, or is it nonsense like a penguin with no flippers?</w:t>
+            </w:r>
           </w:p>
           <w:p>
             <w:pPr>

</xml_diff>

<commit_message>
fix: CODAP prints r, not R squared, and add strength bands
Sebastian's screenshot of CODAP 3.6.5 shows the least squares box
reporting r directly (r = 0.7847 on AFL height vs weight, which matches
the dataset's r of 0.785; R squared would have been 0.616). The page was
telling students to square root it, so anyone following the site would
have turned 0.78 into 0.88. Concord's own how-to pages still describe the
old R squared behaviour, so the docs are stale, not the screenshot. The
fallback sentence stays for anyone on an older build.

Adds strength bands (0.75 strong / 0.5 moderate / 0.25 weak) because the
unit only ever taught "strength is distance from zero", which left 25
students each choosing their own word and no consistent basis to mark
them. Captioned as a guide rather than a law.

Template redownloaded with the same corrections plus red typing colour.

Co-Authored-By: Claude Opus 5 <noreply@anthropic.com>
Claude-Session: https://claude.ai/code/session_01NirdDpEkz972L2Wn9EY8FV
</commit_message>
<xml_diff>
--- a/src/datalab/Y10_Data_Lab_Investigation_Template.docx
+++ b/src/datalab/Y10_Data_Lab_Investigation_Template.docx
@@ -74,6 +74,9 @@
           </w:tcPr>
           <w:p>
             <w:pPr>
+              <w:rPr>
+                <w:color w:val="C00000"/>
+              </w:rPr>
               <w:spacing w:after="0"/>
             </w:pPr>
           </w:p>
@@ -112,6 +115,9 @@
           </w:tcPr>
           <w:p>
             <w:pPr>
+              <w:rPr>
+                <w:color w:val="C00000"/>
+              </w:rPr>
               <w:spacing w:after="0"/>
             </w:pPr>
           </w:p>
@@ -150,6 +156,9 @@
           </w:tcPr>
           <w:p>
             <w:pPr>
+              <w:rPr>
+                <w:color w:val="C00000"/>
+              </w:rPr>
               <w:spacing w:after="0"/>
             </w:pPr>
           </w:p>
@@ -194,7 +203,7 @@
               <w:rPr>
                 <w:sz w:val="19"/>
               </w:rPr>
-              <w:t>1  Open it in Google Docs. Type straight into the shaded boxes. They grow as you type.</w:t>
+              <w:t>1  Open it in Google Docs. Type straight into the shaded boxes. They grow as you type, and your writing comes out in red, so you can see at a glance how much of this you have filled.</w:t>
             </w:r>
           </w:p>
           <w:p>
@@ -286,53 +295,13 @@
         </w:rPr>
         <w:t>Dataset name:</w:t>
       </w:r>
-    </w:p>
-    <w:tbl>
-      <w:tblPr>
-        <w:tblLayout w:type="fixed"/>
-        <w:tblLook w:firstColumn="1" w:firstRow="1" w:lastColumn="0" w:lastRow="0" w:noHBand="0" w:noVBand="1" w:val="04A0"/>
-        <w:tblW w:w="10432" w:type="dxa"/>
-      </w:tblPr>
-      <w:tblGrid>
-        <w:gridCol w:w="10800"/>
-      </w:tblGrid>
-      <w:tr>
-        <w:trPr>
-          <w:trHeight w:val="351" w:hRule="atLeast"/>
-          <w:cantSplit/>
-        </w:trPr>
-        <w:tc>
-          <w:tcPr>
-            <w:tcW w:type="dxa" w:w="10431"/>
-            <w:shd w:val="clear" w:fill="F2F5FA"/>
-          </w:tcPr>
-          <w:p>
-            <w:pPr>
-              <w:spacing w:after="0"/>
-            </w:pPr>
-            <w:r>
-              <w:rPr>
-                <w:i/>
-                <w:color w:val="8C8C8C"/>
-                <w:sz w:val="18"/>
-              </w:rPr>
-              <w:t>the file you chose</w:t>
-            </w:r>
-          </w:p>
-        </w:tc>
-      </w:tr>
-    </w:tbl>
-    <w:p>
-      <w:pPr>
-        <w:spacing w:before="140" w:after="20"/>
-        <w:keepNext/>
-      </w:pPr>
       <w:r>
         <w:rPr>
-          <w:b/>
-          <w:sz w:val="21"/>
+          <w:i/>
+          <w:color w:val="8C8C8C"/>
+          <w:sz w:val="18"/>
         </w:rPr>
-        <w:t>One row in this file is one:</w:t>
+        <w:t xml:space="preserve">  the file you chose</w:t>
       </w:r>
     </w:p>
     <w:tbl>
@@ -356,16 +325,62 @@
           </w:tcPr>
           <w:p>
             <w:pPr>
+              <w:rPr>
+                <w:color w:val="C00000"/>
+              </w:rPr>
               <w:spacing w:after="0"/>
             </w:pPr>
-            <w:r>
+          </w:p>
+        </w:tc>
+      </w:tr>
+    </w:tbl>
+    <w:p>
+      <w:pPr>
+        <w:spacing w:before="140" w:after="20"/>
+        <w:keepNext/>
+      </w:pPr>
+      <w:r>
+        <w:rPr>
+          <w:b/>
+          <w:sz w:val="21"/>
+        </w:rPr>
+        <w:t>One row in this file is one:</w:t>
+      </w:r>
+      <w:r>
+        <w:rPr>
+          <w:i/>
+          <w:color w:val="8C8C8C"/>
+          <w:sz w:val="18"/>
+        </w:rPr>
+        <w:t xml:space="preserve">  one penguin, one player, one song ...</w:t>
+      </w:r>
+    </w:p>
+    <w:tbl>
+      <w:tblPr>
+        <w:tblLayout w:type="fixed"/>
+        <w:tblLook w:firstColumn="1" w:firstRow="1" w:lastColumn="0" w:lastRow="0" w:noHBand="0" w:noVBand="1" w:val="04A0"/>
+        <w:tblW w:w="10432" w:type="dxa"/>
+      </w:tblPr>
+      <w:tblGrid>
+        <w:gridCol w:w="10800"/>
+      </w:tblGrid>
+      <w:tr>
+        <w:trPr>
+          <w:trHeight w:val="351" w:hRule="atLeast"/>
+          <w:cantSplit/>
+        </w:trPr>
+        <w:tc>
+          <w:tcPr>
+            <w:tcW w:type="dxa" w:w="10431"/>
+            <w:shd w:val="clear" w:fill="F2F5FA"/>
+          </w:tcPr>
+          <w:p>
+            <w:pPr>
               <w:rPr>
-                <w:i/>
-                <w:color w:val="8C8C8C"/>
-                <w:sz w:val="18"/>
+                <w:color w:val="C00000"/>
               </w:rPr>
-              <w:t>one penguin, one player, one song ...</w:t>
-            </w:r>
+              <w:spacing w:after="0"/>
+            </w:pPr>
           </w:p>
         </w:tc>
       </w:tr>
@@ -404,6 +419,9 @@
           </w:tcPr>
           <w:p>
             <w:pPr>
+              <w:rPr>
+                <w:color w:val="C00000"/>
+              </w:rPr>
               <w:spacing w:after="0"/>
             </w:pPr>
           </w:p>
@@ -490,6 +508,9 @@
           </w:tcPr>
           <w:p>
             <w:pPr>
+              <w:rPr>
+                <w:color w:val="C00000"/>
+              </w:rPr>
               <w:spacing w:after="0"/>
             </w:pPr>
           </w:p>
@@ -528,6 +549,9 @@
           </w:tcPr>
           <w:p>
             <w:pPr>
+              <w:rPr>
+                <w:color w:val="C00000"/>
+              </w:rPr>
               <w:spacing w:after="0"/>
             </w:pPr>
           </w:p>
@@ -566,6 +590,9 @@
           </w:tcPr>
           <w:p>
             <w:pPr>
+              <w:rPr>
+                <w:color w:val="C00000"/>
+              </w:rPr>
               <w:spacing w:after="0"/>
             </w:pPr>
           </w:p>
@@ -606,6 +633,14 @@
         </w:rPr>
         <w:t>My question, written out in full:</w:t>
       </w:r>
+      <w:r>
+        <w:rPr>
+          <w:i/>
+          <w:color w:val="8C8C8C"/>
+          <w:sz w:val="18"/>
+        </w:rPr>
+        <w:t xml:space="preserve">  type your question here</w:t>
+      </w:r>
     </w:p>
     <w:tbl>
       <w:tblPr>
@@ -628,19 +663,17 @@
           </w:tcPr>
           <w:p>
             <w:pPr>
+              <w:rPr>
+                <w:color w:val="C00000"/>
+              </w:rPr>
               <w:spacing w:after="0"/>
             </w:pPr>
-            <w:r>
-              <w:rPr>
-                <w:i/>
-                <w:color w:val="8C8C8C"/>
-                <w:sz w:val="18"/>
-              </w:rPr>
-              <w:t>type your question here</w:t>
-            </w:r>
           </w:p>
           <w:p>
             <w:pPr>
+              <w:rPr>
+                <w:color w:val="C00000"/>
+              </w:rPr>
               <w:spacing w:after="0"/>
             </w:pPr>
           </w:p>
@@ -785,6 +818,9 @@
           </w:tcPr>
           <w:p>
             <w:pPr>
+              <w:rPr>
+                <w:color w:val="C00000"/>
+              </w:rPr>
               <w:spacing w:after="0"/>
             </w:pPr>
           </w:p>
@@ -825,6 +861,9 @@
           </w:tcPr>
           <w:p>
             <w:pPr>
+              <w:rPr>
+                <w:color w:val="C00000"/>
+              </w:rPr>
               <w:spacing w:after="0"/>
             </w:pPr>
           </w:p>
@@ -865,11 +904,17 @@
           </w:tcPr>
           <w:p>
             <w:pPr>
+              <w:rPr>
+                <w:color w:val="C00000"/>
+              </w:rPr>
               <w:spacing w:after="0"/>
             </w:pPr>
           </w:p>
           <w:p>
             <w:pPr>
+              <w:rPr>
+                <w:color w:val="C00000"/>
+              </w:rPr>
               <w:spacing w:after="0"/>
             </w:pPr>
           </w:p>
@@ -937,6 +982,9 @@
           </w:tcPr>
           <w:p>
             <w:pPr>
+              <w:rPr>
+                <w:color w:val="C00000"/>
+              </w:rPr>
               <w:spacing w:after="0"/>
             </w:pPr>
           </w:p>
@@ -977,11 +1025,17 @@
           </w:tcPr>
           <w:p>
             <w:pPr>
+              <w:rPr>
+                <w:color w:val="C00000"/>
+              </w:rPr>
               <w:spacing w:after="0"/>
             </w:pPr>
           </w:p>
           <w:p>
             <w:pPr>
+              <w:rPr>
+                <w:color w:val="C00000"/>
+              </w:rPr>
               <w:spacing w:after="0"/>
             </w:pPr>
           </w:p>
@@ -1292,7 +1346,7 @@
           <w:b/>
           <w:sz w:val="21"/>
         </w:rPr>
-        <w:t>(a)  How many dots actually plotted (watch for blank cells):</w:t>
+        <w:t>(a)  Can you spot any missing data in the table? Do you think it affected your dots?</w:t>
       </w:r>
     </w:p>
     <w:tbl>
@@ -1306,7 +1360,7 @@
       </w:tblGrid>
       <w:tr>
         <w:trPr>
-          <w:trHeight w:val="351" w:hRule="atLeast"/>
+          <w:trHeight w:val="703" w:hRule="atLeast"/>
           <w:cantSplit/>
         </w:trPr>
         <w:tc>
@@ -1316,6 +1370,17 @@
           </w:tcPr>
           <w:p>
             <w:pPr>
+              <w:rPr>
+                <w:color w:val="C00000"/>
+              </w:rPr>
+              <w:spacing w:after="0"/>
+            </w:pPr>
+          </w:p>
+          <w:p>
+            <w:pPr>
+              <w:rPr>
+                <w:color w:val="C00000"/>
+              </w:rPr>
               <w:spacing w:after="0"/>
             </w:pPr>
           </w:p>
@@ -1356,6 +1421,9 @@
           </w:tcPr>
           <w:p>
             <w:pPr>
+              <w:rPr>
+                <w:color w:val="C00000"/>
+              </w:rPr>
               <w:spacing w:after="0"/>
             </w:pPr>
           </w:p>
@@ -1396,11 +1464,17 @@
           </w:tcPr>
           <w:p>
             <w:pPr>
+              <w:rPr>
+                <w:color w:val="C00000"/>
+              </w:rPr>
               <w:spacing w:after="0"/>
             </w:pPr>
           </w:p>
           <w:p>
             <w:pPr>
+              <w:rPr>
+                <w:color w:val="C00000"/>
+              </w:rPr>
               <w:spacing w:after="0"/>
             </w:pPr>
           </w:p>
@@ -1441,11 +1515,17 @@
           </w:tcPr>
           <w:p>
             <w:pPr>
+              <w:rPr>
+                <w:color w:val="C00000"/>
+              </w:rPr>
               <w:spacing w:after="0"/>
             </w:pPr>
           </w:p>
           <w:p>
             <w:pPr>
+              <w:rPr>
+                <w:color w:val="C00000"/>
+              </w:rPr>
               <w:spacing w:after="0"/>
             </w:pPr>
           </w:p>
@@ -1551,6 +1631,9 @@
           </w:tcPr>
           <w:p>
             <w:pPr>
+              <w:rPr>
+                <w:color w:val="C00000"/>
+              </w:rPr>
               <w:spacing w:after="0"/>
             </w:pPr>
           </w:p>
@@ -1589,6 +1672,9 @@
           </w:tcPr>
           <w:p>
             <w:pPr>
+              <w:rPr>
+                <w:color w:val="C00000"/>
+              </w:rPr>
               <w:spacing w:after="0"/>
             </w:pPr>
           </w:p>
@@ -1627,6 +1713,9 @@
           </w:tcPr>
           <w:p>
             <w:pPr>
+              <w:rPr>
+                <w:color w:val="C00000"/>
+              </w:rPr>
               <w:spacing w:after="0"/>
             </w:pPr>
           </w:p>
@@ -1683,6 +1772,9 @@
           </w:tcPr>
           <w:p>
             <w:pPr>
+              <w:rPr>
+                <w:color w:val="C00000"/>
+              </w:rPr>
               <w:spacing w:after="0"/>
             </w:pPr>
           </w:p>
@@ -1721,6 +1813,9 @@
           </w:tcPr>
           <w:p>
             <w:pPr>
+              <w:rPr>
+                <w:color w:val="C00000"/>
+              </w:rPr>
               <w:spacing w:after="0"/>
             </w:pPr>
           </w:p>
@@ -1796,11 +1891,17 @@
           </w:tcPr>
           <w:p>
             <w:pPr>
+              <w:rPr>
+                <w:color w:val="C00000"/>
+              </w:rPr>
               <w:spacing w:after="0"/>
             </w:pPr>
           </w:p>
           <w:p>
             <w:pPr>
+              <w:rPr>
+                <w:color w:val="C00000"/>
+              </w:rPr>
               <w:spacing w:after="0"/>
             </w:pPr>
           </w:p>
@@ -1818,7 +1919,7 @@
           <w:i w:val="0"/>
           <w:sz w:val="24"/>
         </w:rPr>
-        <w:t>8   Get r</w:t>
+        <w:t>8   Read r</w:t>
       </w:r>
     </w:p>
     <w:p>
@@ -1831,7 +1932,7 @@
           <w:i w:val="0"/>
           <w:sz w:val="21"/>
         </w:rPr>
-        <w:t>CODAP gives you R squared, not r. Turn it into r, and show the working.</w:t>
+        <w:t>CODAP prints r in the yellow box beside your line. Copy it down, then check it against the word you guessed in Question 7.</w:t>
       </w:r>
     </w:p>
     <w:p>
@@ -1844,7 +1945,7 @@
           <w:b/>
           <w:sz w:val="21"/>
         </w:rPr>
-        <w:t>(a)  R squared from CODAP:</w:t>
+        <w:t>(a)  r from CODAP:</w:t>
       </w:r>
     </w:p>
     <w:tbl>
@@ -1868,6 +1969,9 @@
           </w:tcPr>
           <w:p>
             <w:pPr>
+              <w:rPr>
+                <w:color w:val="C00000"/>
+              </w:rPr>
               <w:spacing w:after="0"/>
             </w:pPr>
           </w:p>
@@ -1884,7 +1988,7 @@
           <w:b/>
           <w:sz w:val="21"/>
         </w:rPr>
-        <w:t>(b)  Square root of that:</w:t>
+        <w:t>(b)  Is your line uphill or downhill, and does the sign of r agree with it:</w:t>
       </w:r>
     </w:p>
     <w:tbl>
@@ -1908,8 +2012,99 @@
           </w:tcPr>
           <w:p>
             <w:pPr>
+              <w:rPr>
+                <w:color w:val="C00000"/>
+              </w:rPr>
               <w:spacing w:after="0"/>
             </w:pPr>
+          </w:p>
+        </w:tc>
+      </w:tr>
+    </w:tbl>
+    <w:tbl>
+      <w:tblPr>
+        <w:tblLayout w:type="fixed"/>
+        <w:tblLook w:firstColumn="1" w:firstRow="1" w:lastColumn="0" w:lastRow="0" w:noHBand="0" w:noVBand="1" w:val="04A0"/>
+        <w:tblW w:w="10432" w:type="dxa"/>
+      </w:tblPr>
+      <w:tblGrid>
+        <w:gridCol w:w="10800"/>
+      </w:tblGrid>
+      <w:tr>
+        <w:trPr>
+          <w:cantSplit/>
+        </w:trPr>
+        <w:tc>
+          <w:tcPr>
+            <w:tcW w:type="dxa" w:w="10431"/>
+            <w:shd w:val="clear" w:fill="FFF2CC"/>
+          </w:tcPr>
+          <w:p>
+            <w:pPr>
+              <w:spacing w:after="40"/>
+            </w:pPr>
+            <w:r>
+              <w:rPr>
+                <w:b/>
+                <w:sz w:val="21"/>
+              </w:rPr>
+              <w:t>Strength bands. Ignore the sign and look at the size.</w:t>
+            </w:r>
+          </w:p>
+          <w:p>
+            <w:pPr>
+              <w:spacing w:after="20"/>
+            </w:pPr>
+            <w:r>
+              <w:rPr>
+                <w:sz w:val="19"/>
+              </w:rPr>
+              <w:t>0.75 up to 1        strong</w:t>
+            </w:r>
+          </w:p>
+          <w:p>
+            <w:pPr>
+              <w:spacing w:after="20"/>
+            </w:pPr>
+            <w:r>
+              <w:rPr>
+                <w:sz w:val="19"/>
+              </w:rPr>
+              <w:t>0.5 up to 0.75      moderate</w:t>
+            </w:r>
+          </w:p>
+          <w:p>
+            <w:pPr>
+              <w:spacing w:after="20"/>
+            </w:pPr>
+            <w:r>
+              <w:rPr>
+                <w:sz w:val="19"/>
+              </w:rPr>
+              <w:t>0.25 up to 0.5      weak</w:t>
+            </w:r>
+          </w:p>
+          <w:p>
+            <w:pPr>
+              <w:spacing w:after="20"/>
+            </w:pPr>
+            <w:r>
+              <w:rPr>
+                <w:sz w:val="19"/>
+              </w:rPr>
+              <w:t>below 0.25          no association worth talking about</w:t>
+            </w:r>
+          </w:p>
+          <w:p>
+            <w:pPr>
+              <w:spacing w:after="20"/>
+            </w:pPr>
+            <w:r>
+              <w:rPr>
+                <w:sz w:val="19"/>
+              </w:rPr>
+              <w:t>A guide, not a law. r = 0.74 and r = 0.76 are not different animals, and a curved plot can carry a healthy r and still deserve no straight line at all. Always look at the picture as well as the number.</w:t>
+            </w:r>
           </w:p>
         </w:tc>
       </w:tr>
@@ -1924,7 +2119,7 @@
           <w:b/>
           <w:sz w:val="21"/>
         </w:rPr>
-        <w:t>(c)  Does the line slope up or down, so is r positive or negative:</w:t>
+        <w:t>(c)  Which band does your r fall in:</w:t>
       </w:r>
     </w:p>
     <w:tbl>
@@ -1948,6 +2143,9 @@
           </w:tcPr>
           <w:p>
             <w:pPr>
+              <w:rPr>
+                <w:color w:val="C00000"/>
+              </w:rPr>
               <w:spacing w:after="0"/>
             </w:pPr>
           </w:p>
@@ -1964,7 +2162,7 @@
           <w:b/>
           <w:sz w:val="21"/>
         </w:rPr>
-        <w:t>(d)  So r =</w:t>
+        <w:t>(d)  Does that match the strength word you used in Question 7? If not, go back and fix Question 7:</w:t>
       </w:r>
     </w:p>
     <w:tbl>
@@ -1978,7 +2176,7 @@
       </w:tblGrid>
       <w:tr>
         <w:trPr>
-          <w:trHeight w:val="351" w:hRule="atLeast"/>
+          <w:trHeight w:val="703" w:hRule="atLeast"/>
           <w:cantSplit/>
         </w:trPr>
         <w:tc>
@@ -1988,6 +2186,17 @@
           </w:tcPr>
           <w:p>
             <w:pPr>
+              <w:rPr>
+                <w:color w:val="C00000"/>
+              </w:rPr>
+              <w:spacing w:after="0"/>
+            </w:pPr>
+          </w:p>
+          <w:p>
+            <w:pPr>
+              <w:rPr>
+                <w:color w:val="C00000"/>
+              </w:rPr>
               <w:spacing w:after="0"/>
             </w:pPr>
           </w:p>
@@ -2001,7 +2210,7 @@
           <w:i/>
           <w:sz w:val="19"/>
         </w:rPr>
-        <w:t>The sign only tells you direction. Strength is distance from zero, so r = -0.9 beats r = +0.2.</w:t>
+        <w:t>The sign only tells you direction. Strength is distance from zero, so r = -0.9 beats r = +0.2. If your box shows R squared instead of r, square root it and take the sign from the slope of the line.</w:t>
       </w:r>
     </w:p>
     <w:p>
@@ -2065,6 +2274,9 @@
           </w:tcPr>
           <w:p>
             <w:pPr>
+              <w:rPr>
+                <w:color w:val="C00000"/>
+              </w:rPr>
               <w:spacing w:after="0"/>
             </w:pPr>
           </w:p>
@@ -2134,6 +2346,9 @@
           </w:tcPr>
           <w:p>
             <w:pPr>
+              <w:rPr>
+                <w:color w:val="C00000"/>
+              </w:rPr>
               <w:spacing w:after="0"/>
             </w:pPr>
           </w:p>
@@ -2172,12 +2387,29 @@
           </w:tcPr>
           <w:p>
             <w:pPr>
+              <w:rPr>
+                <w:color w:val="C00000"/>
+              </w:rPr>
               <w:spacing w:after="0"/>
             </w:pPr>
           </w:p>
         </w:tc>
       </w:tr>
     </w:tbl>
+    <w:p>
+      <w:pPr>
+        <w:spacing w:before="140" w:after="20"/>
+        <w:keepNext/>
+      </w:pPr>
+      <w:r>
+        <w:rPr>
+          <w:i/>
+          <w:color w:val="8C8C8C"/>
+          <w:sz w:val="18"/>
+        </w:rPr>
+        <w:t>... is worth this much more of the other thing. Write it as a sentence, in your own units.</w:t>
+      </w:r>
+    </w:p>
     <w:tbl>
       <w:tblPr>
         <w:tblLayout w:type="fixed"/>
@@ -2199,19 +2431,17 @@
           </w:tcPr>
           <w:p>
             <w:pPr>
+              <w:rPr>
+                <w:color w:val="C00000"/>
+              </w:rPr>
               <w:spacing w:after="0"/>
             </w:pPr>
-            <w:r>
-              <w:rPr>
-                <w:i/>
-                <w:color w:val="8C8C8C"/>
-                <w:sz w:val="18"/>
-              </w:rPr>
-              <w:t>... is worth this much more of the other thing. Write it as a sentence, in your own units.</w:t>
-            </w:r>
           </w:p>
           <w:p>
             <w:pPr>
+              <w:rPr>
+                <w:color w:val="C00000"/>
+              </w:rPr>
               <w:spacing w:after="0"/>
             </w:pPr>
           </w:p>
@@ -2279,12 +2509,29 @@
           </w:tcPr>
           <w:p>
             <w:pPr>
+              <w:rPr>
+                <w:color w:val="C00000"/>
+              </w:rPr>
               <w:spacing w:after="0"/>
             </w:pPr>
           </w:p>
         </w:tc>
       </w:tr>
     </w:tbl>
+    <w:p>
+      <w:pPr>
+        <w:spacing w:before="140" w:after="20"/>
+        <w:keepNext/>
+      </w:pPr>
+      <w:r>
+        <w:rPr>
+          <w:i/>
+          <w:color w:val="8C8C8C"/>
+          <w:sz w:val="18"/>
+        </w:rPr>
+        <w:t>Does it mean anything real here, or is it nonsense like a penguin with no flippers?</w:t>
+      </w:r>
+    </w:p>
     <w:tbl>
       <w:tblPr>
         <w:tblLayout w:type="fixed"/>
@@ -2306,19 +2553,17 @@
           </w:tcPr>
           <w:p>
             <w:pPr>
+              <w:rPr>
+                <w:color w:val="C00000"/>
+              </w:rPr>
               <w:spacing w:after="0"/>
             </w:pPr>
-            <w:r>
-              <w:rPr>
-                <w:i/>
-                <w:color w:val="8C8C8C"/>
-                <w:sz w:val="18"/>
-              </w:rPr>
-              <w:t>Does it mean anything real here, or is it nonsense like a penguin with no flippers?</w:t>
-            </w:r>
           </w:p>
           <w:p>
             <w:pPr>
+              <w:rPr>
+                <w:color w:val="C00000"/>
+              </w:rPr>
               <w:spacing w:after="0"/>
             </w:pPr>
           </w:p>
@@ -2386,6 +2631,9 @@
           </w:tcPr>
           <w:p>
             <w:pPr>
+              <w:rPr>
+                <w:color w:val="C00000"/>
+              </w:rPr>
               <w:spacing w:after="0"/>
             </w:pPr>
           </w:p>
@@ -2426,6 +2674,9 @@
           </w:tcPr>
           <w:p>
             <w:pPr>
+              <w:rPr>
+                <w:color w:val="C00000"/>
+              </w:rPr>
               <w:spacing w:after="0"/>
             </w:pPr>
           </w:p>
@@ -2466,6 +2717,9 @@
           </w:tcPr>
           <w:p>
             <w:pPr>
+              <w:rPr>
+                <w:color w:val="C00000"/>
+              </w:rPr>
               <w:spacing w:after="0"/>
             </w:pPr>
           </w:p>
@@ -2510,7 +2764,7 @@
               <w:rPr>
                 <w:sz w:val="19"/>
               </w:rPr>
-              <w:t>R squared from the tool: 0.67.   Square root: 0.82.   Line slopes up, so r = +0.82.</w:t>
+              <w:t>r from the box: +0.82. The line runs uphill, which agrees with the plus sign, and 0.82 is a long way from zero, so that is a strong positive association.</w:t>
             </w:r>
           </w:p>
           <w:p>
@@ -2629,6 +2883,9 @@
           </w:tcPr>
           <w:p>
             <w:pPr>
+              <w:rPr>
+                <w:color w:val="C00000"/>
+              </w:rPr>
               <w:spacing w:after="0"/>
             </w:pPr>
           </w:p>
@@ -2669,11 +2926,17 @@
           </w:tcPr>
           <w:p>
             <w:pPr>
+              <w:rPr>
+                <w:color w:val="C00000"/>
+              </w:rPr>
               <w:spacing w:after="0"/>
             </w:pPr>
           </w:p>
           <w:p>
             <w:pPr>
+              <w:rPr>
+                <w:color w:val="C00000"/>
+              </w:rPr>
               <w:spacing w:after="0"/>
             </w:pPr>
           </w:p>
@@ -2806,16 +3069,25 @@
           </w:tcPr>
           <w:p>
             <w:pPr>
+              <w:rPr>
+                <w:color w:val="C00000"/>
+              </w:rPr>
               <w:spacing w:after="0"/>
             </w:pPr>
           </w:p>
           <w:p>
             <w:pPr>
+              <w:rPr>
+                <w:color w:val="C00000"/>
+              </w:rPr>
               <w:spacing w:after="0"/>
             </w:pPr>
           </w:p>
           <w:p>
             <w:pPr>
+              <w:rPr>
+                <w:color w:val="C00000"/>
+              </w:rPr>
               <w:spacing w:after="0"/>
             </w:pPr>
           </w:p>
@@ -2856,6 +3128,9 @@
           </w:tcPr>
           <w:p>
             <w:pPr>
+              <w:rPr>
+                <w:color w:val="C00000"/>
+              </w:rPr>
               <w:spacing w:after="0"/>
             </w:pPr>
           </w:p>
@@ -2886,7 +3161,20 @@
           <w:i w:val="0"/>
           <w:sz w:val="21"/>
         </w:rPr>
-        <w:t>Answer the question you wrote in Question 2. Quote your r, quote a number from your line, and say one thing your data cannot tell you.</w:t>
+        <w:t>Answer Question 2 in plain English, as if you were telling someone who never saw your graph. Two sentences, no more.</w:t>
+      </w:r>
+    </w:p>
+    <w:p>
+      <w:pPr>
+        <w:spacing w:before="140" w:after="20"/>
+        <w:keepNext/>
+      </w:pPr>
+      <w:r>
+        <w:rPr>
+          <w:b/>
+          <w:sz w:val="21"/>
+        </w:rPr>
+        <w:t>(a)  The answer, quoting your r and one number off your line:</w:t>
       </w:r>
     </w:p>
     <w:tbl>
@@ -2900,7 +3188,7 @@
       </w:tblGrid>
       <w:tr>
         <w:trPr>
-          <w:trHeight w:val="1757" w:hRule="atLeast"/>
+          <w:trHeight w:val="1054" w:hRule="atLeast"/>
           <w:cantSplit/>
         </w:trPr>
         <w:tc>
@@ -2910,34 +3198,92 @@
           </w:tcPr>
           <w:p>
             <w:pPr>
-              <w:spacing w:after="0"/>
-            </w:pPr>
-            <w:r>
               <w:rPr>
-                <w:i/>
-                <w:color w:val="8C8C8C"/>
-                <w:sz w:val="18"/>
+                <w:color w:val="C00000"/>
               </w:rPr>
-              <w:t>type your answer here</w:t>
-            </w:r>
-          </w:p>
-          <w:p>
-            <w:pPr>
               <w:spacing w:after="0"/>
             </w:pPr>
           </w:p>
           <w:p>
             <w:pPr>
+              <w:rPr>
+                <w:color w:val="C00000"/>
+              </w:rPr>
               <w:spacing w:after="0"/>
             </w:pPr>
           </w:p>
           <w:p>
             <w:pPr>
+              <w:rPr>
+                <w:color w:val="C00000"/>
+              </w:rPr>
+              <w:spacing w:after="0"/>
+            </w:pPr>
+          </w:p>
+        </w:tc>
+      </w:tr>
+    </w:tbl>
+    <w:p>
+      <w:pPr>
+        <w:spacing w:before="140" w:after="20"/>
+        <w:keepNext/>
+      </w:pPr>
+      <w:r>
+        <w:rPr>
+          <w:b/>
+          <w:sz w:val="21"/>
+        </w:rPr>
+        <w:t>(b)  One thing this data cannot tell you:</w:t>
+      </w:r>
+      <w:r>
+        <w:rPr>
+          <w:i/>
+          <w:color w:val="8C8C8C"/>
+          <w:sz w:val="18"/>
+        </w:rPr>
+        <w:t xml:space="preserve">  the best question on this sheet, so do not rush it</w:t>
+      </w:r>
+    </w:p>
+    <w:tbl>
+      <w:tblPr>
+        <w:tblLayout w:type="fixed"/>
+        <w:tblLook w:firstColumn="1" w:firstRow="1" w:lastColumn="0" w:lastRow="0" w:noHBand="0" w:noVBand="1" w:val="04A0"/>
+        <w:tblW w:w="10432" w:type="dxa"/>
+      </w:tblPr>
+      <w:tblGrid>
+        <w:gridCol w:w="10800"/>
+      </w:tblGrid>
+      <w:tr>
+        <w:trPr>
+          <w:trHeight w:val="1054" w:hRule="atLeast"/>
+          <w:cantSplit/>
+        </w:trPr>
+        <w:tc>
+          <w:tcPr>
+            <w:tcW w:type="dxa" w:w="10431"/>
+            <w:shd w:val="clear" w:fill="F2F5FA"/>
+          </w:tcPr>
+          <w:p>
+            <w:pPr>
+              <w:rPr>
+                <w:color w:val="C00000"/>
+              </w:rPr>
               <w:spacing w:after="0"/>
             </w:pPr>
           </w:p>
           <w:p>
             <w:pPr>
+              <w:rPr>
+                <w:color w:val="C00000"/>
+              </w:rPr>
+              <w:spacing w:after="0"/>
+            </w:pPr>
+          </w:p>
+          <w:p>
+            <w:pPr>
+              <w:rPr>
+                <w:color w:val="C00000"/>
+              </w:rPr>
               <w:spacing w:after="0"/>
             </w:pPr>
           </w:p>
@@ -3015,6 +3361,20 @@
         </w:tc>
       </w:tr>
     </w:tbl>
+    <w:p>
+      <w:pPr>
+        <w:spacing w:before="140" w:after="20"/>
+        <w:keepNext/>
+      </w:pPr>
+      <w:r>
+        <w:rPr>
+          <w:i/>
+          <w:color w:val="8C8C8C"/>
+          <w:sz w:val="18"/>
+        </w:rPr>
+        <w:t>paste the boxplots here if you made them, then write your four sentences</w:t>
+      </w:r>
+    </w:p>
     <w:tbl>
       <w:tblPr>
         <w:tblLayout w:type="fixed"/>
@@ -3036,34 +3396,41 @@
           </w:tcPr>
           <w:p>
             <w:pPr>
-              <w:spacing w:after="0"/>
-            </w:pPr>
-            <w:r>
               <w:rPr>
-                <w:i/>
-                <w:color w:val="8C8C8C"/>
-                <w:sz w:val="18"/>
+                <w:color w:val="C00000"/>
               </w:rPr>
-              <w:t>paste the boxplots here if you made them, then write your four sentences</w:t>
-            </w:r>
-          </w:p>
-          <w:p>
-            <w:pPr>
               <w:spacing w:after="0"/>
             </w:pPr>
           </w:p>
           <w:p>
             <w:pPr>
+              <w:rPr>
+                <w:color w:val="C00000"/>
+              </w:rPr>
               <w:spacing w:after="0"/>
             </w:pPr>
           </w:p>
           <w:p>
             <w:pPr>
+              <w:rPr>
+                <w:color w:val="C00000"/>
+              </w:rPr>
               <w:spacing w:after="0"/>
             </w:pPr>
           </w:p>
           <w:p>
             <w:pPr>
+              <w:rPr>
+                <w:color w:val="C00000"/>
+              </w:rPr>
+              <w:spacing w:after="0"/>
+            </w:pPr>
+          </w:p>
+          <w:p>
+            <w:pPr>
+              <w:rPr>
+                <w:color w:val="C00000"/>
+              </w:rPr>
               <w:spacing w:after="0"/>
             </w:pPr>
           </w:p>

</xml_diff>